<commit_message>
Fix: Explicitly expose 'record' object to docx-templates data mapping
</commit_message>
<xml_diff>
--- a/public/templates/Informe_de_necessitats_AD.docx
+++ b/public/templates/Informe_de_necessitats_AD.docx
@@ -94,7 +94,28 @@
           <w:szCs w:val="20"/>
           <w:lang w:val="ca-ES"/>
         </w:rPr>
-        <w:t>«Òrgan_de_contractació»</w:t>
+        <w:t>«</w:t>
+      </w:r>
+      <w:r>
+        <w:rPr>
+          <w:rFonts w:ascii="Open Sans Light" w:eastAsia="Open Sans Light" w:hAnsi="Open Sans Light" w:cs="Open Sans Light"/>
+          <w:b/>
+          <w:noProof/>
+          <w:sz w:val="20"/>
+          <w:szCs w:val="20"/>
+        </w:rPr>
+        <w:t>record.organ_contractacio</w:t>
+      </w:r>
+      <w:r>
+        <w:rPr>
+          <w:rFonts w:ascii="Open Sans Light" w:eastAsia="Open Sans Light" w:hAnsi="Open Sans Light" w:cs="Open Sans Light"/>
+          <w:b/>
+          <w:noProof/>
+          <w:sz w:val="20"/>
+          <w:szCs w:val="20"/>
+          <w:lang w:val="ca-ES"/>
+        </w:rPr>
+        <w:t>»</w:t>
       </w:r>
       <w:r>
         <w:rPr>
@@ -275,7 +296,26 @@
           <w:szCs w:val="20"/>
           <w:lang w:val="ca-ES"/>
         </w:rPr>
-        <w:t>«Responsable_del_contracte»</w:t>
+        <w:t>«</w:t>
+      </w:r>
+      <w:r>
+        <w:rPr>
+          <w:rFonts w:ascii="Open Sans Light" w:eastAsia="Open Sans Light" w:hAnsi="Open Sans Light" w:cs="Open Sans Light"/>
+          <w:noProof/>
+          <w:sz w:val="20"/>
+          <w:szCs w:val="20"/>
+        </w:rPr>
+        <w:t>record.responsable_contracte</w:t>
+      </w:r>
+      <w:r>
+        <w:rPr>
+          <w:rFonts w:ascii="Open Sans Light" w:eastAsia="Open Sans Light" w:hAnsi="Open Sans Light" w:cs="Open Sans Light"/>
+          <w:noProof/>
+          <w:sz w:val="20"/>
+          <w:szCs w:val="20"/>
+          <w:lang w:val="ca-ES"/>
+        </w:rPr>
+        <w:t>»</w:t>
       </w:r>
       <w:r>
         <w:rPr>
@@ -359,7 +399,26 @@
           <w:szCs w:val="20"/>
           <w:lang w:val="ca-ES"/>
         </w:rPr>
-        <w:t>«Òrgan_de_contractació»</w:t>
+        <w:t>«</w:t>
+      </w:r>
+      <w:r>
+        <w:rPr>
+          <w:rFonts w:ascii="Open Sans Light" w:eastAsia="Open Sans Light" w:hAnsi="Open Sans Light" w:cs="Open Sans Light"/>
+          <w:noProof/>
+          <w:sz w:val="20"/>
+          <w:szCs w:val="20"/>
+        </w:rPr>
+        <w:t>record.organ_contractacio</w:t>
+      </w:r>
+      <w:r>
+        <w:rPr>
+          <w:rFonts w:ascii="Open Sans Light" w:eastAsia="Open Sans Light" w:hAnsi="Open Sans Light" w:cs="Open Sans Light"/>
+          <w:noProof/>
+          <w:sz w:val="20"/>
+          <w:szCs w:val="20"/>
+          <w:lang w:val="ca-ES"/>
+        </w:rPr>
+        <w:t>»</w:t>
       </w:r>
       <w:r>
         <w:rPr>
@@ -448,7 +507,7 @@
           <w:szCs w:val="20"/>
           <w:lang w:val="ca-ES"/>
         </w:rPr>
-        <w:t>«Nombre»</w:t>
+        <w:t>«record.nom»</w:t>
       </w:r>
       <w:r>
         <w:rPr>
@@ -537,7 +596,7 @@
           <w:szCs w:val="20"/>
           <w:lang w:val="ca-ES"/>
         </w:rPr>
-        <w:t>«Correo_electrónico»</w:t>
+        <w:t>«record.email »</w:t>
       </w:r>
       <w:r>
         <w:rPr>
@@ -632,7 +691,37 @@
           <w:szCs w:val="20"/>
           <w:lang w:val="ca-ES"/>
         </w:rPr>
-        <w:t>«Objecte_del_contrate_descripció_del_que»</w:t>
+        <w:t>«</w:t>
+      </w:r>
+      <w:r>
+        <w:rPr>
+          <w:rFonts w:ascii="Open Sans Light" w:eastAsia="Open Sans Light" w:hAnsi="Open Sans Light" w:cs="Open Sans Light"/>
+          <w:noProof/>
+          <w:sz w:val="20"/>
+          <w:szCs w:val="20"/>
+          <w:lang w:val="ca-ES"/>
+        </w:rPr>
+        <w:t xml:space="preserve"> </w:t>
+      </w:r>
+      <w:r>
+        <w:rPr>
+          <w:rFonts w:ascii="Open Sans Light" w:eastAsia="Open Sans Light" w:hAnsi="Open Sans Light" w:cs="Open Sans Light"/>
+          <w:noProof/>
+          <w:sz w:val="20"/>
+          <w:szCs w:val="20"/>
+          <w:lang w:val="ca-ES"/>
+        </w:rPr>
+        <w:t>record.</w:t>
+      </w:r>
+      <w:r>
+        <w:rPr>
+          <w:rFonts w:ascii="Open Sans Light" w:eastAsia="Open Sans Light" w:hAnsi="Open Sans Light" w:cs="Open Sans Light"/>
+          <w:noProof/>
+          <w:sz w:val="20"/>
+          <w:szCs w:val="20"/>
+          <w:lang w:val="ca-ES"/>
+        </w:rPr>
+        <w:t>objecte_contracte»</w:t>
       </w:r>
       <w:r>
         <w:rPr>
@@ -840,7 +929,7 @@
                 <w:szCs w:val="20"/>
                 <w:lang w:val="ca-ES"/>
               </w:rPr>
-              <w:t>«Tipus_de_contracte»</w:t>
+              <w:t>«record.tipus_contracte»</w:t>
             </w:r>
             <w:r>
               <w:rPr>
@@ -943,7 +1032,7 @@
                 <w:szCs w:val="20"/>
                 <w:lang w:val="ca-ES"/>
               </w:rPr>
-              <w:t>«Descripció_de_la_necessitat_a_satisfer_»</w:t>
+              <w:t>«record.justificacio»</w:t>
             </w:r>
             <w:r>
               <w:rPr>
@@ -1031,7 +1120,7 @@
                 <w:szCs w:val="20"/>
                 <w:lang w:val="ca-ES"/>
               </w:rPr>
-              <w:t>«Códi_dobjecte_contractual_CPV»</w:t>
+              <w:t>«record.codi_cpv »</w:t>
             </w:r>
             <w:r>
               <w:rPr>
@@ -1129,6 +1218,14 @@
                 <w:sz w:val="20"/>
                 <w:szCs w:val="20"/>
               </w:rPr>
+              <w:t xml:space="preserve"> </w:t>
+            </w:r>
+            <w:r>
+              <w:rPr>
+                <w:rFonts w:ascii="Open Sans Light" w:eastAsia="Open Sans Light" w:hAnsi="Open Sans Light" w:cs="Open Sans Light"/>
+                <w:sz w:val="20"/>
+                <w:szCs w:val="20"/>
+              </w:rPr>
               <w:fldChar w:fldCharType="begin"/>
             </w:r>
             <w:r>
@@ -1154,7 +1251,25 @@
                 <w:sz w:val="20"/>
                 <w:szCs w:val="20"/>
               </w:rPr>
-              <w:t>«Característiques_tècniques_especificaci»</w:t>
+              <w:t>«</w:t>
+            </w:r>
+            <w:r>
+              <w:rPr>
+                <w:rFonts w:ascii="Open Sans Light" w:eastAsia="Open Sans Light" w:hAnsi="Open Sans Light" w:cs="Open Sans Light"/>
+                <w:noProof/>
+                <w:sz w:val="20"/>
+                <w:szCs w:val="20"/>
+              </w:rPr>
+              <w:t>record.caracteristiques_tecniques</w:t>
+            </w:r>
+            <w:r>
+              <w:rPr>
+                <w:rFonts w:ascii="Open Sans Light" w:eastAsia="Open Sans Light" w:hAnsi="Open Sans Light" w:cs="Open Sans Light"/>
+                <w:noProof/>
+                <w:sz w:val="20"/>
+                <w:szCs w:val="20"/>
+              </w:rPr>
+              <w:t>»</w:t>
             </w:r>
             <w:r>
               <w:rPr>
@@ -1244,8 +1359,8 @@
         <w:tblLook w:val="0000" w:firstRow="0" w:lastRow="0" w:firstColumn="0" w:lastColumn="0" w:noHBand="0" w:noVBand="0"/>
       </w:tblPr>
       <w:tblGrid>
-        <w:gridCol w:w="2955"/>
-        <w:gridCol w:w="2325"/>
+        <w:gridCol w:w="2782"/>
+        <w:gridCol w:w="2498"/>
         <w:gridCol w:w="3135"/>
       </w:tblGrid>
       <w:tr>
@@ -1254,7 +1369,7 @@
         </w:trPr>
         <w:tc>
           <w:tcPr>
-            <w:tcW w:w="2955" w:type="dxa"/>
+            <w:tcW w:w="2782" w:type="dxa"/>
             <w:tcBorders>
               <w:top w:val="single" w:sz="6" w:space="0" w:color="A6A6A6" w:themeColor="background1" w:themeShade="A6"/>
               <w:left w:val="single" w:sz="6" w:space="0" w:color="A6A6A6" w:themeColor="background1" w:themeShade="A6"/>
@@ -1332,7 +1447,7 @@
                 <w:szCs w:val="20"/>
                 <w:lang w:val="ca-ES"/>
               </w:rPr>
-              <w:t>«Base_imposable_»</w:t>
+              <w:t>«record.base_imposable»</w:t>
             </w:r>
             <w:r>
               <w:rPr>
@@ -1347,7 +1462,7 @@
         </w:tc>
         <w:tc>
           <w:tcPr>
-            <w:tcW w:w="2325" w:type="dxa"/>
+            <w:tcW w:w="2498" w:type="dxa"/>
             <w:tcBorders>
               <w:top w:val="single" w:sz="6" w:space="0" w:color="A6A6A6" w:themeColor="background1" w:themeShade="A6"/>
               <w:left w:val="single" w:sz="6" w:space="0" w:color="A6A6A6" w:themeColor="background1" w:themeShade="A6"/>
@@ -1424,7 +1539,27 @@
                 <w:szCs w:val="20"/>
                 <w:lang w:val="ca-ES"/>
               </w:rPr>
-              <w:t>«Quota_dIVA_»</w:t>
+              <w:t xml:space="preserve">« </w:t>
+            </w:r>
+            <w:r>
+              <w:rPr>
+                <w:rFonts w:ascii="Open Sans Light" w:eastAsia="Open Sans Light" w:hAnsi="Open Sans Light" w:cs="Open Sans Light"/>
+                <w:noProof/>
+                <w:sz w:val="20"/>
+                <w:szCs w:val="20"/>
+                <w:lang w:val="ca-ES"/>
+              </w:rPr>
+              <w:t>record.</w:t>
+            </w:r>
+            <w:r>
+              <w:rPr>
+                <w:rFonts w:ascii="Open Sans Light" w:eastAsia="Open Sans Light" w:hAnsi="Open Sans Light" w:cs="Open Sans Light"/>
+                <w:noProof/>
+                <w:sz w:val="20"/>
+                <w:szCs w:val="20"/>
+                <w:lang w:val="ca-ES"/>
+              </w:rPr>
+              <w:t>quota_iva»</w:t>
             </w:r>
             <w:r>
               <w:rPr>
@@ -1517,7 +1652,26 @@
                 <w:szCs w:val="20"/>
                 <w:lang w:val="ca-ES"/>
               </w:rPr>
-              <w:t>«Import_total_»</w:t>
+              <w:t>«</w:t>
+            </w:r>
+            <w:r>
+              <w:rPr>
+                <w:rFonts w:ascii="Open Sans Light" w:eastAsia="Open Sans Light" w:hAnsi="Open Sans Light" w:cs="Open Sans Light"/>
+                <w:noProof/>
+                <w:sz w:val="20"/>
+                <w:szCs w:val="20"/>
+              </w:rPr>
+              <w:t>total (base + iva)</w:t>
+            </w:r>
+            <w:r>
+              <w:rPr>
+                <w:rFonts w:ascii="Open Sans Light" w:eastAsia="Open Sans Light" w:hAnsi="Open Sans Light" w:cs="Open Sans Light"/>
+                <w:noProof/>
+                <w:sz w:val="20"/>
+                <w:szCs w:val="20"/>
+                <w:lang w:val="ca-ES"/>
+              </w:rPr>
+              <w:t>»</w:t>
             </w:r>
             <w:r>
               <w:rPr>
@@ -1662,7 +1816,7 @@
                 <w:sz w:val="20"/>
                 <w:szCs w:val="20"/>
               </w:rPr>
-              <w:t>«Termini_dexecució_o_durada_previstaen»</w:t>
+              <w:t>«record.termini_execucio»</w:t>
             </w:r>
             <w:r>
               <w:rPr>
@@ -1797,7 +1951,35 @@
                 <w:szCs w:val="20"/>
                 <w:lang w:val="ca-ES"/>
               </w:rPr>
-              <w:t>«Partida orgànica»</w:t>
+              <w:t>«</w:t>
+            </w:r>
+            <w:r>
+              <w:rPr>
+                <w:rFonts w:ascii="Open Sans Light" w:eastAsia="Open Sans Light" w:hAnsi="Open Sans Light" w:cs="Open Sans Light"/>
+                <w:noProof/>
+                <w:sz w:val="20"/>
+                <w:szCs w:val="20"/>
+              </w:rPr>
+              <w:t>record.partida_</w:t>
+            </w:r>
+            <w:r>
+              <w:rPr>
+                <w:rFonts w:ascii="Open Sans Light" w:eastAsia="Open Sans Light" w:hAnsi="Open Sans Light" w:cs="Open Sans Light"/>
+                <w:noProof/>
+                <w:sz w:val="20"/>
+                <w:szCs w:val="20"/>
+              </w:rPr>
+              <w:t>organica</w:t>
+            </w:r>
+            <w:r>
+              <w:rPr>
+                <w:rFonts w:ascii="Open Sans Light" w:eastAsia="Open Sans Light" w:hAnsi="Open Sans Light" w:cs="Open Sans Light"/>
+                <w:noProof/>
+                <w:sz w:val="20"/>
+                <w:szCs w:val="20"/>
+                <w:lang w:val="ca-ES"/>
+              </w:rPr>
+              <w:t>»</w:t>
             </w:r>
             <w:r>
               <w:rPr>
@@ -1852,7 +2034,7 @@
                 <w:szCs w:val="20"/>
                 <w:lang w:val="ca-ES"/>
               </w:rPr>
-              <w:t xml:space="preserve">«Partida </w:t>
+              <w:t>«</w:t>
             </w:r>
             <w:r>
               <w:rPr>
@@ -1860,7 +2042,15 @@
                 <w:noProof/>
                 <w:sz w:val="20"/>
                 <w:szCs w:val="20"/>
-                <w:lang w:val="ca-ES"/>
+              </w:rPr>
+              <w:t>record.partida_</w:t>
+            </w:r>
+            <w:r>
+              <w:rPr>
+                <w:rFonts w:ascii="Open Sans Light" w:eastAsia="Open Sans Light" w:hAnsi="Open Sans Light" w:cs="Open Sans Light"/>
+                <w:noProof/>
+                <w:sz w:val="20"/>
+                <w:szCs w:val="20"/>
               </w:rPr>
               <w:t>programa</w:t>
             </w:r>
@@ -1927,17 +2117,27 @@
                 <w:szCs w:val="20"/>
                 <w:lang w:val="ca-ES"/>
               </w:rPr>
-              <w:t xml:space="preserve">«Partida </w:t>
-            </w:r>
+              <w:t>«</w:t>
+            </w:r>
+            <w:bookmarkStart w:id="0" w:name="_GoBack"/>
+            <w:bookmarkEnd w:id="0"/>
             <w:r>
               <w:rPr>
                 <w:rFonts w:ascii="Open Sans Light" w:eastAsia="Open Sans Light" w:hAnsi="Open Sans Light" w:cs="Open Sans Light"/>
                 <w:noProof/>
                 <w:sz w:val="20"/>
                 <w:szCs w:val="20"/>
-                <w:lang w:val="ca-ES"/>
-              </w:rPr>
-              <w:t>econòmica</w:t>
+              </w:rPr>
+              <w:t>record.partida_</w:t>
+            </w:r>
+            <w:r>
+              <w:rPr>
+                <w:rFonts w:ascii="Open Sans Light" w:eastAsia="Open Sans Light" w:hAnsi="Open Sans Light" w:cs="Open Sans Light"/>
+                <w:noProof/>
+                <w:sz w:val="20"/>
+                <w:szCs w:val="20"/>
+              </w:rPr>
+              <w:t>economica</w:t>
             </w:r>
             <w:r>
               <w:rPr>
@@ -2031,8 +2231,6 @@
           <w:lang w:val="ca-ES"/>
         </w:rPr>
       </w:pPr>
-      <w:bookmarkStart w:id="0" w:name="_GoBack"/>
-      <w:bookmarkEnd w:id="0"/>
     </w:p>
     <w:p>
       <w:pPr>
@@ -3184,7 +3382,6 @@
   <w:style w:type="character" w:default="1" w:styleId="Fuentedeprrafopredeter">
     <w:name w:val="Default Paragraph Font"/>
     <w:uiPriority w:val="1"/>
-    <w:semiHidden/>
     <w:unhideWhenUsed/>
   </w:style>
   <w:style w:type="table" w:default="1" w:styleId="Tablanormal">
@@ -3537,17 +3734,6 @@
 </file>
 
 <file path=customXml/item2.xml><?xml version="1.0" encoding="utf-8"?>
-<p:properties xmlns:p="http://schemas.microsoft.com/office/2006/metadata/properties" xmlns:xsi="http://www.w3.org/2001/XMLSchema-instance" xmlns:pc="http://schemas.microsoft.com/office/infopath/2007/PartnerControls">
-  <documentManagement>
-    <TaxCatchAll xmlns="108d9c73-5d46-4471-9bd8-029f5de3680f" xsi:nil="true"/>
-    <lcf76f155ced4ddcb4097134ff3c332f xmlns="74cf42d7-5302-4f1c-a14a-4e00bba5b2a8">
-      <Terms xmlns="http://schemas.microsoft.com/office/infopath/2007/PartnerControls"/>
-    </lcf76f155ced4ddcb4097134ff3c332f>
-  </documentManagement>
-</p:properties>
-</file>
-
-<file path=customXml/item3.xml><?xml version="1.0" encoding="utf-8"?>
 <ct:contentTypeSchema xmlns:ct="http://schemas.microsoft.com/office/2006/metadata/contentType" xmlns:ma="http://schemas.microsoft.com/office/2006/metadata/properties/metaAttributes" ct:_="" ma:_="" ma:contentTypeName="Documento" ma:contentTypeID="0x010100BEA9B1C7EBF6D3438CD7ED5E9E199432" ma:contentTypeVersion="14" ma:contentTypeDescription="Crear nuevo documento." ma:contentTypeScope="" ma:versionID="2e283e6bc3a5fbbefccc32c5f809dde4">
   <xsd:schema xmlns:xsd="http://www.w3.org/2001/XMLSchema" xmlns:xs="http://www.w3.org/2001/XMLSchema" xmlns:p="http://schemas.microsoft.com/office/2006/metadata/properties" xmlns:ns2="74cf42d7-5302-4f1c-a14a-4e00bba5b2a8" xmlns:ns3="108d9c73-5d46-4471-9bd8-029f5de3680f" targetNamespace="http://schemas.microsoft.com/office/2006/metadata/properties" ma:root="true" ma:fieldsID="670afdc93dcbe6e64409644886b33f83" ns2:_="" ns3:_="">
     <xsd:import namespace="74cf42d7-5302-4f1c-a14a-4e00bba5b2a8"/>
@@ -3776,6 +3962,17 @@
 </ct:contentTypeSchema>
 </file>
 
+<file path=customXml/item3.xml><?xml version="1.0" encoding="utf-8"?>
+<p:properties xmlns:p="http://schemas.microsoft.com/office/2006/metadata/properties" xmlns:xsi="http://www.w3.org/2001/XMLSchema-instance" xmlns:pc="http://schemas.microsoft.com/office/infopath/2007/PartnerControls">
+  <documentManagement>
+    <TaxCatchAll xmlns="108d9c73-5d46-4471-9bd8-029f5de3680f" xsi:nil="true"/>
+    <lcf76f155ced4ddcb4097134ff3c332f xmlns="74cf42d7-5302-4f1c-a14a-4e00bba5b2a8">
+      <Terms xmlns="http://schemas.microsoft.com/office/infopath/2007/PartnerControls"/>
+    </lcf76f155ced4ddcb4097134ff3c332f>
+  </documentManagement>
+</p:properties>
+</file>
+
 <file path=customXml/itemProps1.xml><?xml version="1.0" encoding="utf-8"?>
 <ds:datastoreItem xmlns:ds="http://schemas.openxmlformats.org/officeDocument/2006/customXml" ds:itemID="{150801C8-2C01-424E-BC6C-56C9B08C462E}">
   <ds:schemaRefs>
@@ -3785,23 +3982,6 @@
 </file>
 
 <file path=customXml/itemProps2.xml><?xml version="1.0" encoding="utf-8"?>
-<ds:datastoreItem xmlns:ds="http://schemas.openxmlformats.org/officeDocument/2006/customXml" ds:itemID="{EF14DB54-CEC9-47B5-A13D-53C8A329E037}">
-  <ds:schemaRefs>
-    <ds:schemaRef ds:uri="http://schemas.microsoft.com/office/2006/metadata/properties"/>
-    <ds:schemaRef ds:uri="http://schemas.microsoft.com/office/2006/documentManagement/types"/>
-    <ds:schemaRef ds:uri="http://purl.org/dc/terms/"/>
-    <ds:schemaRef ds:uri="http://schemas.microsoft.com/office/infopath/2007/PartnerControls"/>
-    <ds:schemaRef ds:uri="74cf42d7-5302-4f1c-a14a-4e00bba5b2a8"/>
-    <ds:schemaRef ds:uri="108d9c73-5d46-4471-9bd8-029f5de3680f"/>
-    <ds:schemaRef ds:uri="http://purl.org/dc/elements/1.1/"/>
-    <ds:schemaRef ds:uri="http://purl.org/dc/dcmitype/"/>
-    <ds:schemaRef ds:uri="http://schemas.openxmlformats.org/package/2006/metadata/core-properties"/>
-    <ds:schemaRef ds:uri="http://www.w3.org/XML/1998/namespace"/>
-  </ds:schemaRefs>
-</ds:datastoreItem>
-</file>
-
-<file path=customXml/itemProps3.xml><?xml version="1.0" encoding="utf-8"?>
 <ds:datastoreItem xmlns:ds="http://schemas.openxmlformats.org/officeDocument/2006/customXml" ds:itemID="{02882DF2-B128-4C90-8FFD-571E4B92AFFE}">
   <ds:schemaRefs>
     <ds:schemaRef ds:uri="http://schemas.microsoft.com/office/2006/metadata/contentType"/>
@@ -3818,4 +3998,21 @@
     <ds:schemaRef ds:uri="http://schemas.microsoft.com/internal/obd"/>
   </ds:schemaRefs>
 </ds:datastoreItem>
+</file>
+
+<file path=customXml/itemProps3.xml><?xml version="1.0" encoding="utf-8"?>
+<ds:datastoreItem xmlns:ds="http://schemas.openxmlformats.org/officeDocument/2006/customXml" ds:itemID="{EF14DB54-CEC9-47B5-A13D-53C8A329E037}">
+  <ds:schemaRefs>
+    <ds:schemaRef ds:uri="http://schemas.microsoft.com/office/2006/metadata/properties"/>
+    <ds:schemaRef ds:uri="http://schemas.microsoft.com/office/2006/documentManagement/types"/>
+    <ds:schemaRef ds:uri="http://purl.org/dc/terms/"/>
+    <ds:schemaRef ds:uri="http://schemas.microsoft.com/office/infopath/2007/PartnerControls"/>
+    <ds:schemaRef ds:uri="74cf42d7-5302-4f1c-a14a-4e00bba5b2a8"/>
+    <ds:schemaRef ds:uri="108d9c73-5d46-4471-9bd8-029f5de3680f"/>
+    <ds:schemaRef ds:uri="http://purl.org/dc/elements/1.1/"/>
+    <ds:schemaRef ds:uri="http://purl.org/dc/dcmitype/"/>
+    <ds:schemaRef ds:uri="http://schemas.openxmlformats.org/package/2006/metadata/core-properties"/>
+    <ds:schemaRef ds:uri="http://www.w3.org/XML/1998/namespace"/>
+  </ds:schemaRefs>
+</ds:datastoreItem>
 </file>
</xml_diff>